<commit_message>
Filght Price Prediction updates
</commit_message>
<xml_diff>
--- a/Data_Mining/Flight_Price_Prediction/Project_Proposal.docx
+++ b/Data_Mining/Flight_Price_Prediction/Project_Proposal.docx
@@ -7,8 +7,34 @@
         <w:ind w:left="720" w:hanging="360"/>
         <w:rPr>
           <w:rFonts w:ascii="Segoe UI" w:hAnsi="Segoe UI" w:cs="Segoe UI"/>
-        </w:rPr>
-      </w:pPr>
+          <w:b/>
+          <w:bCs/>
+        </w:rPr>
+      </w:pPr>
+      <w:r>
+        <w:rPr>
+          <w:rFonts w:ascii="Segoe UI" w:hAnsi="Segoe UI" w:cs="Segoe UI"/>
+          <w:b/>
+          <w:bCs/>
+        </w:rPr>
+        <w:t xml:space="preserve">Project Proposal for </w:t>
+      </w:r>
+      <w:r>
+        <w:rPr>
+          <w:rFonts w:ascii="Segoe UI" w:hAnsi="Segoe UI" w:cs="Segoe UI"/>
+          <w:b/>
+          <w:bCs/>
+        </w:rPr>
+        <w:t>Flight Price Prediction</w:t>
+      </w:r>
+      <w:r>
+        <w:rPr>
+          <w:rFonts w:ascii="Segoe UI" w:hAnsi="Segoe UI" w:cs="Segoe UI"/>
+          <w:b/>
+          <w:bCs/>
+        </w:rPr>
+        <w:t xml:space="preserve"> </w:t>
+      </w:r>
     </w:p>
     <w:p>
       <w:pPr>

</xml_diff>